<commit_message>
Add asset migration, master maintenance and company archive management
</commit_message>
<xml_diff>
--- a/readme.docx
+++ b/readme.docx
@@ -145,13 +145,49 @@
         <w:rPr>
           <w:rFonts w:ascii="ＭＳ Ｐゴシック" w:eastAsia="ＭＳ Ｐゴシック" w:hAnsi="ＭＳ Ｐゴシック" w:hint="eastAsia"/>
         </w:rPr>
-        <w:t>3</w:t>
-      </w:r>
-    </w:p>
-    <w:p>
-      <w:pPr>
-        <w:rPr>
-          <w:rFonts w:ascii="ＭＳ Ｐゴシック" w:eastAsia="ＭＳ Ｐゴシック" w:hAnsi="ＭＳ Ｐゴシック"/>
+        <w:t>4</w:t>
+      </w:r>
+    </w:p>
+    <w:p>
+      <w:pPr>
+        <w:rPr>
+          <w:rFonts w:ascii="ＭＳ Ｐゴシック" w:eastAsia="ＭＳ Ｐゴシック" w:hAnsi="ＭＳ Ｐゴシック"/>
+        </w:rPr>
+      </w:pPr>
+    </w:p>
+    <w:p>
+      <w:pPr>
+        <w:rPr>
+          <w:rFonts w:ascii="ＭＳ Ｐゴシック" w:eastAsia="ＭＳ Ｐゴシック" w:hAnsi="ＭＳ Ｐゴシック"/>
+        </w:rPr>
+      </w:pPr>
+      <w:r>
+        <w:rPr>
+          <w:rFonts w:ascii="ＭＳ Ｐゴシック" w:eastAsia="ＭＳ Ｐゴシック" w:hAnsi="ＭＳ Ｐゴシック" w:hint="eastAsia"/>
+        </w:rPr>
+        <w:t>製品サポートはWebのみでの対応となります。状況によってお答えできない可能性がありますこと、ご了承願います。</w:t>
+      </w:r>
+    </w:p>
+    <w:p>
+      <w:pPr>
+        <w:rPr>
+          <w:rFonts w:ascii="ＭＳ Ｐゴシック" w:eastAsia="ＭＳ Ｐゴシック" w:hAnsi="ＭＳ Ｐゴシック"/>
+        </w:rPr>
+      </w:pPr>
+      <w:hyperlink r:id="rId11" w:history="1">
+        <w:r>
+          <w:rPr>
+            <w:rStyle w:val="aa"/>
+            <w:rFonts w:ascii="ＭＳ Ｐゴシック" w:eastAsia="ＭＳ Ｐゴシック" w:hAnsi="ＭＳ Ｐゴシック"/>
+          </w:rPr>
+          <w:t>https://forms.office.com/r/fEbr6Cgb7E</w:t>
+        </w:r>
+      </w:hyperlink>
+    </w:p>
+    <w:p>
+      <w:pPr>
+        <w:rPr>
+          <w:rFonts w:ascii="ＭＳ Ｐゴシック" w:eastAsia="ＭＳ Ｐゴシック" w:hAnsi="ＭＳ Ｐゴシック" w:hint="eastAsia"/>
         </w:rPr>
       </w:pPr>
     </w:p>
@@ -511,7 +547,7 @@
     <w:p>
       <w:pPr>
         <w:rPr>
-          <w:rFonts w:ascii="ＭＳ Ｐゴシック" w:eastAsia="ＭＳ Ｐゴシック" w:hAnsi="ＭＳ Ｐゴシック" w:hint="eastAsia"/>
+          <w:rFonts w:ascii="ＭＳ Ｐゴシック" w:eastAsia="ＭＳ Ｐゴシック" w:hAnsi="ＭＳ Ｐゴシック"/>
         </w:rPr>
       </w:pPr>
       <w:r>
@@ -5615,18 +5651,6 @@
 </file>
 
 <file path=customXml/item2.xml><?xml version="1.0" encoding="utf-8"?>
-<p:properties xmlns:p="http://schemas.microsoft.com/office/2006/metadata/properties" xmlns:xsi="http://www.w3.org/2001/XMLSchema-instance" xmlns:pc="http://schemas.microsoft.com/office/infopath/2007/PartnerControls">
-  <documentManagement>
-    <_activity xmlns="3963c53f-597e-49f3-8825-2891d3039750" xsi:nil="true"/>
-  </documentManagement>
-</p:properties>
-</file>
-
-<file path=customXml/item3.xml><?xml version="1.0" encoding="utf-8"?>
-<b:Sources xmlns:b="http://schemas.openxmlformats.org/officeDocument/2006/bibliography" xmlns="http://schemas.openxmlformats.org/officeDocument/2006/bibliography" SelectedStyle="\APASixthEditionOfficeOnline.xsl" StyleName="APA" Version="6"/>
-</file>
-
-<file path=customXml/item4.xml><?xml version="1.0" encoding="utf-8"?>
 <ct:contentTypeSchema xmlns:ct="http://schemas.microsoft.com/office/2006/metadata/contentType" xmlns:ma="http://schemas.microsoft.com/office/2006/metadata/properties/metaAttributes" ct:_="" ma:_="" ma:contentTypeName="ドキュメント" ma:contentTypeID="0x0101005E25E907DDBD434E9320CA1BB4D4AA59" ma:contentTypeVersion="18" ma:contentTypeDescription="新しいドキュメントを作成します。" ma:contentTypeScope="" ma:versionID="5ece6cb8ff669c55680bec9d22ea331b">
   <xsd:schema xmlns:xsd="http://www.w3.org/2001/XMLSchema" xmlns:xs="http://www.w3.org/2001/XMLSchema" xmlns:p="http://schemas.microsoft.com/office/2006/metadata/properties" xmlns:ns3="3963c53f-597e-49f3-8825-2891d3039750" xmlns:ns4="8e351511-a7f6-4092-82a6-9bccf4168657" targetNamespace="http://schemas.microsoft.com/office/2006/metadata/properties" ma:root="true" ma:fieldsID="6068f63bc1548b25cc3dd4430b53260e" ns3:_="" ns4:_="">
     <xsd:import namespace="3963c53f-597e-49f3-8825-2891d3039750"/>
@@ -5879,6 +5903,18 @@
 </ct:contentTypeSchema>
 </file>
 
+<file path=customXml/item3.xml><?xml version="1.0" encoding="utf-8"?>
+<b:Sources xmlns:b="http://schemas.openxmlformats.org/officeDocument/2006/bibliography" xmlns="http://schemas.openxmlformats.org/officeDocument/2006/bibliography" SelectedStyle="\APASixthEditionOfficeOnline.xsl" StyleName="APA" Version="6"/>
+</file>
+
+<file path=customXml/item4.xml><?xml version="1.0" encoding="utf-8"?>
+<p:properties xmlns:p="http://schemas.microsoft.com/office/2006/metadata/properties" xmlns:xsi="http://www.w3.org/2001/XMLSchema-instance" xmlns:pc="http://schemas.microsoft.com/office/infopath/2007/PartnerControls">
+  <documentManagement>
+    <_activity xmlns="3963c53f-597e-49f3-8825-2891d3039750" xsi:nil="true"/>
+  </documentManagement>
+</p:properties>
+</file>
+
 <file path=customXml/itemProps1.xml><?xml version="1.0" encoding="utf-8"?>
 <ds:datastoreItem xmlns:ds="http://schemas.openxmlformats.org/officeDocument/2006/customXml" ds:itemID="{0977E48A-B7BA-4F6F-9E6F-E19874C01286}">
   <ds:schemaRefs>
@@ -5888,24 +5924,6 @@
 </file>
 
 <file path=customXml/itemProps2.xml><?xml version="1.0" encoding="utf-8"?>
-<ds:datastoreItem xmlns:ds="http://schemas.openxmlformats.org/officeDocument/2006/customXml" ds:itemID="{36CCBBC6-D353-445F-B05A-B0AECD3591E5}">
-  <ds:schemaRefs>
-    <ds:schemaRef ds:uri="http://schemas.microsoft.com/office/2006/metadata/properties"/>
-    <ds:schemaRef ds:uri="http://schemas.microsoft.com/office/infopath/2007/PartnerControls"/>
-    <ds:schemaRef ds:uri="3963c53f-597e-49f3-8825-2891d3039750"/>
-  </ds:schemaRefs>
-</ds:datastoreItem>
-</file>
-
-<file path=customXml/itemProps3.xml><?xml version="1.0" encoding="utf-8"?>
-<ds:datastoreItem xmlns:ds="http://schemas.openxmlformats.org/officeDocument/2006/customXml" ds:itemID="{46A44504-DC16-4BBD-B45A-7810F3658721}">
-  <ds:schemaRefs>
-    <ds:schemaRef ds:uri="http://schemas.openxmlformats.org/officeDocument/2006/bibliography"/>
-  </ds:schemaRefs>
-</ds:datastoreItem>
-</file>
-
-<file path=customXml/itemProps4.xml><?xml version="1.0" encoding="utf-8"?>
 <ds:datastoreItem xmlns:ds="http://schemas.openxmlformats.org/officeDocument/2006/customXml" ds:itemID="{FB75F15C-8B7C-49F9-8180-CE4E441373B0}">
   <ds:schemaRefs>
     <ds:schemaRef ds:uri="http://schemas.microsoft.com/office/2006/metadata/contentType"/>
@@ -5922,4 +5940,22 @@
     <ds:schemaRef ds:uri="http://schemas.microsoft.com/internal/obd"/>
   </ds:schemaRefs>
 </ds:datastoreItem>
+</file>
+
+<file path=customXml/itemProps3.xml><?xml version="1.0" encoding="utf-8"?>
+<ds:datastoreItem xmlns:ds="http://schemas.openxmlformats.org/officeDocument/2006/customXml" ds:itemID="{46A44504-DC16-4BBD-B45A-7810F3658721}">
+  <ds:schemaRefs>
+    <ds:schemaRef ds:uri="http://schemas.openxmlformats.org/officeDocument/2006/bibliography"/>
+  </ds:schemaRefs>
+</ds:datastoreItem>
+</file>
+
+<file path=customXml/itemProps4.xml><?xml version="1.0" encoding="utf-8"?>
+<ds:datastoreItem xmlns:ds="http://schemas.openxmlformats.org/officeDocument/2006/customXml" ds:itemID="{36CCBBC6-D353-445F-B05A-B0AECD3591E5}">
+  <ds:schemaRefs>
+    <ds:schemaRef ds:uri="http://schemas.microsoft.com/office/2006/metadata/properties"/>
+    <ds:schemaRef ds:uri="http://schemas.microsoft.com/office/infopath/2007/PartnerControls"/>
+    <ds:schemaRef ds:uri="3963c53f-597e-49f3-8825-2891d3039750"/>
+  </ds:schemaRefs>
+</ds:datastoreItem>
 </file>
</xml_diff>